<commit_message>
Publish 1.2.0 teaching and source assets
</commit_message>
<xml_diff>
--- a/Boiler_Furnace_Simulator_Class_Lab_Exercises.docx
+++ b/Boiler_Furnace_Simulator_Class_Lab_Exercises.docx
@@ -61,6 +61,9 @@
             </w:r>
           </w:p>
         </w:tc>
+        <w:trPr>
+          <w:tblHeader/>
+        </w:trPr>
       </w:tr>
     </w:tbl>
     <w:p>
@@ -92,7 +95,7 @@
         <w:pStyle w:val="ListBullet"/>
       </w:pPr>
       <w:r>
-        <w:t>Exercises 8-10 integrate emissions diagnosis, fault identification and open-ended optimization.</w:t>
+        <w:t>Exercises 8-13 integrate emissions diagnosis, fault identification, energy accounting, inventory protection, alarm chronology and open-ended optimization.</w:t>
       </w:r>
     </w:p>
     <w:p>
@@ -186,6 +189,9 @@
             </w:r>
           </w:p>
         </w:tc>
+        <w:trPr>
+          <w:tblHeader/>
+        </w:trPr>
       </w:tr>
       <w:tr>
         <w:tc>
@@ -513,6 +519,9 @@
             </w:r>
           </w:p>
         </w:tc>
+        <w:trPr>
+          <w:tblHeader/>
+        </w:trPr>
       </w:tr>
       <w:tr>
         <w:tc>
@@ -734,6 +743,9 @@
             </w:r>
           </w:p>
         </w:tc>
+        <w:trPr>
+          <w:tblHeader/>
+        </w:trPr>
       </w:tr>
       <w:tr>
         <w:tc>
@@ -1193,6 +1205,9 @@
             </w:r>
           </w:p>
         </w:tc>
+        <w:trPr>
+          <w:tblHeader/>
+        </w:trPr>
       </w:tr>
       <w:tr>
         <w:tc>
@@ -1406,6 +1421,9 @@
             </w:r>
           </w:p>
         </w:tc>
+        <w:trPr>
+          <w:tblHeader/>
+        </w:trPr>
       </w:tr>
       <w:tr>
         <w:tc>
@@ -1821,6 +1839,9 @@
             </w:r>
           </w:p>
         </w:tc>
+        <w:trPr>
+          <w:tblHeader/>
+        </w:trPr>
       </w:tr>
       <w:tr>
         <w:tc>
@@ -2034,6 +2055,9 @@
             </w:r>
           </w:p>
         </w:tc>
+        <w:trPr>
+          <w:tblHeader/>
+        </w:trPr>
       </w:tr>
       <w:tr>
         <w:tc>
@@ -2493,6 +2517,9 @@
             </w:r>
           </w:p>
         </w:tc>
+        <w:trPr>
+          <w:tblHeader/>
+        </w:trPr>
       </w:tr>
       <w:tr>
         <w:tc>
@@ -2714,6 +2741,9 @@
             </w:r>
           </w:p>
         </w:tc>
+        <w:trPr>
+          <w:tblHeader/>
+        </w:trPr>
       </w:tr>
       <w:tr>
         <w:tc>
@@ -3107,6 +3137,9 @@
             </w:r>
           </w:p>
         </w:tc>
+        <w:trPr>
+          <w:tblHeader/>
+        </w:trPr>
       </w:tr>
       <w:tr>
         <w:tc>
@@ -3320,6 +3353,9 @@
             </w:r>
           </w:p>
         </w:tc>
+        <w:trPr>
+          <w:tblHeader/>
+        </w:trPr>
       </w:tr>
       <w:tr>
         <w:tc>
@@ -3713,6 +3749,9 @@
             </w:r>
           </w:p>
         </w:tc>
+        <w:trPr>
+          <w:tblHeader/>
+        </w:trPr>
       </w:tr>
       <w:tr>
         <w:tc>
@@ -3926,6 +3965,9 @@
             </w:r>
           </w:p>
         </w:tc>
+        <w:trPr>
+          <w:tblHeader/>
+        </w:trPr>
       </w:tr>
       <w:tr>
         <w:tc>
@@ -4352,6 +4394,9 @@
             </w:r>
           </w:p>
         </w:tc>
+        <w:trPr>
+          <w:tblHeader/>
+        </w:trPr>
       </w:tr>
       <w:tr>
         <w:tc>
@@ -4565,6 +4610,9 @@
             </w:r>
           </w:p>
         </w:tc>
+        <w:trPr>
+          <w:tblHeader/>
+        </w:trPr>
       </w:tr>
       <w:tr>
         <w:tc>
@@ -4999,6 +5047,9 @@
             </w:r>
           </w:p>
         </w:tc>
+        <w:trPr>
+          <w:tblHeader/>
+        </w:trPr>
       </w:tr>
       <w:tr>
         <w:tc>
@@ -5220,6 +5271,9 @@
             </w:r>
           </w:p>
         </w:tc>
+        <w:trPr>
+          <w:tblHeader/>
+        </w:trPr>
       </w:tr>
       <w:tr>
         <w:tc>
@@ -5728,6 +5782,9 @@
             </w:r>
           </w:p>
         </w:tc>
+        <w:trPr>
+          <w:tblHeader/>
+        </w:trPr>
       </w:tr>
       <w:tr>
         <w:tc>
@@ -5949,6 +6006,9 @@
             </w:r>
           </w:p>
         </w:tc>
+        <w:trPr>
+          <w:tblHeader/>
+        </w:trPr>
       </w:tr>
       <w:tr>
         <w:tc>
@@ -6430,6 +6490,9 @@
             </w:r>
           </w:p>
         </w:tc>
+        <w:trPr>
+          <w:tblHeader/>
+        </w:trPr>
       </w:tr>
       <w:tr>
         <w:tc>
@@ -6659,6 +6722,9 @@
             </w:r>
           </w:p>
         </w:tc>
+        <w:trPr>
+          <w:tblHeader/>
+        </w:trPr>
       </w:tr>
       <w:tr>
         <w:tc>
@@ -7052,6 +7118,1646 @@
       </w:pPr>
       <w:r>
         <w:t>Conclusions explicitly distinguish educational trends from real-plant design or regulatory analysis.</w:t>
+      </w:r>
+    </w:p>
+    <w:p>
+      <w:pPr>
+        <w:pStyle w:val="ExerciseTitle"/>
+      </w:pPr>
+      <w:r>
+        <w:t>Exercise 11: Reading the Live Energy Sankey</w:t>
+      </w:r>
+    </w:p>
+    <w:tbl>
+      <w:tblPr>
+        <w:tblStyle w:val="TableGrid"/>
+        <w:tblW w:type="auto" w:w="0"/>
+        <w:jc w:val="center"/>
+        <w:tblLook w:firstColumn="1" w:firstRow="1" w:lastColumn="0" w:lastRow="0" w:noHBand="0" w:noVBand="1" w:val="04A0"/>
+      </w:tblPr>
+      <w:tblGrid>
+        <w:gridCol w:w="3389"/>
+        <w:gridCol w:w="3389"/>
+        <w:gridCol w:w="3389"/>
+      </w:tblGrid>
+      <w:tr>
+        <w:tc>
+          <w:tcPr>
+            <w:tcW w:type="dxa" w:w="3389"/>
+            <w:vAlign w:val="center"/>
+            <w:shd w:fill="7D1238"/>
+          </w:tcPr>
+          <w:p>
+            <w:r>
+              <w:t>Suggested duration</w:t>
+            </w:r>
+          </w:p>
+        </w:tc>
+        <w:tc>
+          <w:tcPr>
+            <w:tcW w:type="dxa" w:w="3389"/>
+            <w:vAlign w:val="center"/>
+            <w:shd w:fill="7D1238"/>
+          </w:tcPr>
+          <w:p>
+            <w:r>
+              <w:t>Format</w:t>
+            </w:r>
+          </w:p>
+        </w:tc>
+        <w:tc>
+          <w:tcPr>
+            <w:tcW w:type="dxa" w:w="3389"/>
+            <w:vAlign w:val="center"/>
+            <w:shd w:fill="7D1238"/>
+          </w:tcPr>
+          <w:p>
+            <w:r>
+              <w:t>Difficulty</w:t>
+            </w:r>
+          </w:p>
+        </w:tc>
+        <w:trPr>
+          <w:tblHeader/>
+        </w:trPr>
+      </w:tr>
+      <w:tr>
+        <w:tc>
+          <w:tcPr>
+            <w:tcW w:type="dxa" w:w="3389"/>
+            <w:vAlign w:val="center"/>
+          </w:tcPr>
+          <w:p>
+            <w:r>
+              <w:t>45-60 min</w:t>
+            </w:r>
+          </w:p>
+        </w:tc>
+        <w:tc>
+          <w:tcPr>
+            <w:tcW w:type="dxa" w:w="3389"/>
+            <w:vAlign w:val="center"/>
+          </w:tcPr>
+          <w:p>
+            <w:r>
+              <w:t>Pairs</w:t>
+            </w:r>
+          </w:p>
+        </w:tc>
+        <w:tc>
+          <w:tcPr>
+            <w:tcW w:type="dxa" w:w="3389"/>
+            <w:vAlign w:val="center"/>
+          </w:tcPr>
+          <w:p>
+            <w:r>
+              <w:t>Intermediate</w:t>
+            </w:r>
+          </w:p>
+        </w:tc>
+      </w:tr>
+    </w:tbl>
+    <w:p>
+      <w:pPr>
+        <w:pStyle w:val="Heading2"/>
+      </w:pPr>
+      <w:r>
+        <w:t>Learning objectives</w:t>
+      </w:r>
+    </w:p>
+    <w:p>
+      <w:pPr>
+        <w:pStyle w:val="ListBullet"/>
+      </w:pPr>
+      <w:r>
+        <w:t>Interpret the direction and magnitude of the Sankey energy streams.</w:t>
+      </w:r>
+    </w:p>
+    <w:p>
+      <w:pPr>
+        <w:pStyle w:val="ListBullet"/>
+      </w:pPr>
+      <w:r>
+        <w:t>Connect fuel input, useful boiler heat and individual losses to efficiency.</w:t>
+      </w:r>
+    </w:p>
+    <w:p>
+      <w:pPr>
+        <w:pStyle w:val="ListBullet"/>
+      </w:pPr>
+      <w:r>
+        <w:t>Check whether the displayed energy balance closes within the reduced-order model.</w:t>
+      </w:r>
+    </w:p>
+    <w:p>
+      <w:pPr>
+        <w:pStyle w:val="Heading2"/>
+      </w:pPr>
+      <w:r>
+        <w:t>Initial setup</w:t>
+      </w:r>
+    </w:p>
+    <w:p>
+      <w:pPr>
+        <w:pStyle w:val="ListBullet"/>
+      </w:pPr>
+      <w:r>
+        <w:t>Reset and stabilize on Natural Gas with coordinated firing enabled.</w:t>
+      </w:r>
+    </w:p>
+    <w:p>
+      <w:pPr>
+        <w:pStyle w:val="ListBullet"/>
+      </w:pPr>
+      <w:r>
+        <w:t>Open the Energy Sankey, Trends and Diagnostics tabs.</w:t>
+      </w:r>
+    </w:p>
+    <w:p>
+      <w:pPr>
+        <w:pStyle w:val="ListBullet"/>
+      </w:pPr>
+      <w:r>
+        <w:t>Keep excess air, fouling and fuel moisture at their baseline values initially.</w:t>
+      </w:r>
+    </w:p>
+    <w:p>
+      <w:pPr>
+        <w:pStyle w:val="Heading2"/>
+      </w:pPr>
+      <w:r>
+        <w:t>Procedure</w:t>
+      </w:r>
+    </w:p>
+    <w:p>
+      <w:pPr>
+        <w:pStyle w:val="ListNumber"/>
+      </w:pPr>
+      <w:r>
+        <w:t>Record the baseline fuel input, boiler heat, wall loss, stack loss, incomplete-combustion loss, moisture loss, ash loss and balance residual.</w:t>
+      </w:r>
+    </w:p>
+    <w:p>
+      <w:pPr>
+        <w:pStyle w:val="ListNumber"/>
+      </w:pPr>
+      <w:r>
+        <w:t>Raise excess air to 45%, allow the response to settle and record the changed Sankey streams.</w:t>
+      </w:r>
+    </w:p>
+    <w:p>
+      <w:pPr>
+        <w:pStyle w:val="ListNumber"/>
+      </w:pPr>
+      <w:r>
+        <w:t>Restore excess air, inject Tube fouling and compare the redistribution of useful heat and stack loss.</w:t>
+      </w:r>
+    </w:p>
+    <w:p>
+      <w:pPr>
+        <w:pStyle w:val="ListNumber"/>
+      </w:pPr>
+      <w:r>
+        <w:t>Inject Wet fuel and identify which displayed loss pathway changes most directly.</w:t>
+      </w:r>
+    </w:p>
+    <w:p>
+      <w:pPr>
+        <w:pStyle w:val="ListNumber"/>
+      </w:pPr>
+      <w:r>
+        <w:t>For each case, calculate useful heat divided by fuel input and compare it with displayed efficiency.</w:t>
+      </w:r>
+    </w:p>
+    <w:p>
+      <w:pPr>
+        <w:pStyle w:val="Heading2"/>
+      </w:pPr>
+      <w:r>
+        <w:t>Data to record</w:t>
+      </w:r>
+    </w:p>
+    <w:tbl>
+      <w:tblPr>
+        <w:tblStyle w:val="TableGrid"/>
+        <w:tblW w:type="auto" w:w="0"/>
+        <w:jc w:val="center"/>
+        <w:tblLook w:firstColumn="1" w:firstRow="1" w:lastColumn="0" w:lastRow="0" w:noHBand="0" w:noVBand="1" w:val="04A0"/>
+      </w:tblPr>
+      <w:tblGrid>
+        <w:gridCol w:w="5083"/>
+        <w:gridCol w:w="5083"/>
+      </w:tblGrid>
+      <w:tr>
+        <w:tc>
+          <w:tcPr>
+            <w:tcW w:type="dxa" w:w="5083"/>
+            <w:vAlign w:val="center"/>
+            <w:shd w:fill="333333"/>
+          </w:tcPr>
+          <w:p>
+            <w:r>
+              <w:t>Variable / observation</w:t>
+            </w:r>
+          </w:p>
+        </w:tc>
+        <w:tc>
+          <w:tcPr>
+            <w:tcW w:type="dxa" w:w="5083"/>
+            <w:vAlign w:val="center"/>
+            <w:shd w:fill="333333"/>
+          </w:tcPr>
+          <w:p>
+            <w:r>
+              <w:t>Recorded value / notes</w:t>
+            </w:r>
+          </w:p>
+        </w:tc>
+        <w:trPr>
+          <w:tblHeader/>
+        </w:trPr>
+      </w:tr>
+      <w:tr>
+        <w:tc>
+          <w:tcPr>
+            <w:tcW w:type="dxa" w:w="5083"/>
+            <w:vAlign w:val="center"/>
+          </w:tcPr>
+          <w:p>
+            <w:r>
+              <w:t>Fuel heat input (kW)</w:t>
+            </w:r>
+          </w:p>
+        </w:tc>
+        <w:tc>
+          <w:tcPr>
+            <w:tcW w:type="dxa" w:w="5083"/>
+            <w:vAlign w:val="center"/>
+          </w:tcPr>
+          <w:p>
+            <w:r/>
+          </w:p>
+        </w:tc>
+      </w:tr>
+      <w:tr>
+        <w:tc>
+          <w:tcPr>
+            <w:tcW w:type="dxa" w:w="5083"/>
+            <w:vAlign w:val="center"/>
+          </w:tcPr>
+          <w:p>
+            <w:r>
+              <w:t>Useful boiler heat (kW)</w:t>
+            </w:r>
+          </w:p>
+        </w:tc>
+        <w:tc>
+          <w:tcPr>
+            <w:tcW w:type="dxa" w:w="5083"/>
+            <w:vAlign w:val="center"/>
+          </w:tcPr>
+          <w:p>
+            <w:r/>
+          </w:p>
+        </w:tc>
+      </w:tr>
+      <w:tr>
+        <w:tc>
+          <w:tcPr>
+            <w:tcW w:type="dxa" w:w="5083"/>
+            <w:vAlign w:val="center"/>
+          </w:tcPr>
+          <w:p>
+            <w:r>
+              <w:t>Wall loss (kW)</w:t>
+            </w:r>
+          </w:p>
+        </w:tc>
+        <w:tc>
+          <w:tcPr>
+            <w:tcW w:type="dxa" w:w="5083"/>
+            <w:vAlign w:val="center"/>
+          </w:tcPr>
+          <w:p>
+            <w:r/>
+          </w:p>
+        </w:tc>
+      </w:tr>
+      <w:tr>
+        <w:tc>
+          <w:tcPr>
+            <w:tcW w:type="dxa" w:w="5083"/>
+            <w:vAlign w:val="center"/>
+          </w:tcPr>
+          <w:p>
+            <w:r>
+              <w:t>Stack loss (kW)</w:t>
+            </w:r>
+          </w:p>
+        </w:tc>
+        <w:tc>
+          <w:tcPr>
+            <w:tcW w:type="dxa" w:w="5083"/>
+            <w:vAlign w:val="center"/>
+          </w:tcPr>
+          <w:p>
+            <w:r/>
+          </w:p>
+        </w:tc>
+      </w:tr>
+      <w:tr>
+        <w:tc>
+          <w:tcPr>
+            <w:tcW w:type="dxa" w:w="5083"/>
+            <w:vAlign w:val="center"/>
+          </w:tcPr>
+          <w:p>
+            <w:r>
+              <w:t>Incomplete-combustion loss (kW)</w:t>
+            </w:r>
+          </w:p>
+        </w:tc>
+        <w:tc>
+          <w:tcPr>
+            <w:tcW w:type="dxa" w:w="5083"/>
+            <w:vAlign w:val="center"/>
+          </w:tcPr>
+          <w:p>
+            <w:r/>
+          </w:p>
+        </w:tc>
+      </w:tr>
+      <w:tr>
+        <w:tc>
+          <w:tcPr>
+            <w:tcW w:type="dxa" w:w="5083"/>
+            <w:vAlign w:val="center"/>
+          </w:tcPr>
+          <w:p>
+            <w:r>
+              <w:t>Moisture/ash losses (kW)</w:t>
+            </w:r>
+          </w:p>
+        </w:tc>
+        <w:tc>
+          <w:tcPr>
+            <w:tcW w:type="dxa" w:w="5083"/>
+            <w:vAlign w:val="center"/>
+          </w:tcPr>
+          <w:p>
+            <w:r/>
+          </w:p>
+        </w:tc>
+      </w:tr>
+      <w:tr>
+        <w:tc>
+          <w:tcPr>
+            <w:tcW w:type="dxa" w:w="5083"/>
+            <w:vAlign w:val="center"/>
+          </w:tcPr>
+          <w:p>
+            <w:r>
+              <w:t>Balance residual (kW)</w:t>
+            </w:r>
+          </w:p>
+        </w:tc>
+        <w:tc>
+          <w:tcPr>
+            <w:tcW w:type="dxa" w:w="5083"/>
+            <w:vAlign w:val="center"/>
+          </w:tcPr>
+          <w:p>
+            <w:r/>
+          </w:p>
+        </w:tc>
+      </w:tr>
+      <w:tr>
+        <w:tc>
+          <w:tcPr>
+            <w:tcW w:type="dxa" w:w="5083"/>
+            <w:vAlign w:val="center"/>
+          </w:tcPr>
+          <w:p>
+            <w:r>
+              <w:t>Displayed/calculated efficiency (%)</w:t>
+            </w:r>
+          </w:p>
+        </w:tc>
+        <w:tc>
+          <w:tcPr>
+            <w:tcW w:type="dxa" w:w="5083"/>
+            <w:vAlign w:val="center"/>
+          </w:tcPr>
+          <w:p>
+            <w:r/>
+          </w:p>
+        </w:tc>
+      </w:tr>
+      <w:tr>
+        <w:tc>
+          <w:tcPr>
+            <w:tcW w:type="dxa" w:w="5083"/>
+            <w:vAlign w:val="center"/>
+          </w:tcPr>
+          <w:p>
+            <w:r>
+              <w:t>Fault or adjustment</w:t>
+            </w:r>
+          </w:p>
+        </w:tc>
+        <w:tc>
+          <w:tcPr>
+            <w:tcW w:type="dxa" w:w="5083"/>
+            <w:vAlign w:val="center"/>
+          </w:tcPr>
+          <w:p>
+            <w:r/>
+          </w:p>
+        </w:tc>
+      </w:tr>
+    </w:tbl>
+    <w:p>
+      <w:pPr>
+        <w:pStyle w:val="Heading2"/>
+      </w:pPr>
+      <w:r>
+        <w:t>Analysis and discussion questions</w:t>
+      </w:r>
+    </w:p>
+    <w:p>
+      <w:pPr>
+        <w:pStyle w:val="ListNumber"/>
+      </w:pPr>
+      <w:r>
+        <w:t>Why must every Sankey outflow be interpreted on the same energy basis?</w:t>
+      </w:r>
+    </w:p>
+    <w:p>
+      <w:pPr>
+        <w:pStyle w:val="ListNumber"/>
+      </w:pPr>
+      <w:r>
+        <w:t>Which loss responds most clearly to excess air, fouling and wet fuel respectively?</w:t>
+      </w:r>
+    </w:p>
+    <w:p>
+      <w:pPr>
+        <w:pStyle w:val="ListNumber"/>
+      </w:pPr>
+      <w:r>
+        <w:t>Why is a small balance residual acceptable numerically but a large residual diagnostically important?</w:t>
+      </w:r>
+    </w:p>
+    <w:p>
+      <w:pPr>
+        <w:pStyle w:val="ListNumber"/>
+      </w:pPr>
+      <w:r>
+        <w:t>Which Sankey values are modeled estimates rather than direct plant measurements?</w:t>
+      </w:r>
+    </w:p>
+    <w:p>
+      <w:pPr>
+        <w:pStyle w:val="Heading2"/>
+      </w:pPr>
+      <w:r>
+        <w:t>Expected qualitative behaviour</w:t>
+      </w:r>
+    </w:p>
+    <w:p>
+      <w:pPr>
+        <w:pStyle w:val="ListBullet"/>
+      </w:pPr>
+      <w:r>
+        <w:t>Higher excess air increases flue-gas sensible loss and can reduce efficiency.</w:t>
+      </w:r>
+    </w:p>
+    <w:p>
+      <w:pPr>
+        <w:pStyle w:val="ListBullet"/>
+      </w:pPr>
+      <w:r>
+        <w:t>Fouling shifts energy away from useful heat capture and toward the stack.</w:t>
+      </w:r>
+    </w:p>
+    <w:p>
+      <w:pPr>
+        <w:pStyle w:val="ListBullet"/>
+      </w:pPr>
+      <w:r>
+        <w:t>Wet fuel increases the moisture-related burden and can reduce steam capability.</w:t>
+      </w:r>
+    </w:p>
+    <w:p>
+      <w:pPr>
+        <w:pStyle w:val="ListBullet"/>
+      </w:pPr>
+      <w:r>
+        <w:t>The Sankey approximately closes because its streams are generated from the same model energy balance.</w:t>
+      </w:r>
+    </w:p>
+    <w:p>
+      <w:pPr>
+        <w:pStyle w:val="TeachingNote"/>
+      </w:pPr>
+      <w:r>
+        <w:t>Teaching note: Treat arrow widths as a live visualization of the simplified balance, not as a substitute for a plant heat-loss test.</w:t>
+      </w:r>
+    </w:p>
+    <w:p>
+      <w:pPr>
+        <w:pStyle w:val="ExerciseTitle"/>
+      </w:pPr>
+      <w:r>
+        <w:t>Exercise 12: Fuel-Feedwater Mismatch and Eventual Drum Fill</w:t>
+      </w:r>
+    </w:p>
+    <w:tbl>
+      <w:tblPr>
+        <w:tblStyle w:val="TableGrid"/>
+        <w:tblW w:type="auto" w:w="0"/>
+        <w:jc w:val="center"/>
+        <w:tblLook w:firstColumn="1" w:firstRow="1" w:lastColumn="0" w:lastRow="0" w:noHBand="0" w:noVBand="1" w:val="04A0"/>
+      </w:tblPr>
+      <w:tblGrid>
+        <w:gridCol w:w="3389"/>
+        <w:gridCol w:w="3389"/>
+        <w:gridCol w:w="3389"/>
+      </w:tblGrid>
+      <w:tr>
+        <w:tc>
+          <w:tcPr>
+            <w:tcW w:type="dxa" w:w="3389"/>
+            <w:vAlign w:val="center"/>
+            <w:shd w:fill="7D1238"/>
+          </w:tcPr>
+          <w:p>
+            <w:r>
+              <w:t>Suggested duration</w:t>
+            </w:r>
+          </w:p>
+        </w:tc>
+        <w:tc>
+          <w:tcPr>
+            <w:tcW w:type="dxa" w:w="3389"/>
+            <w:vAlign w:val="center"/>
+            <w:shd w:fill="7D1238"/>
+          </w:tcPr>
+          <w:p>
+            <w:r>
+              <w:t>Format</w:t>
+            </w:r>
+          </w:p>
+        </w:tc>
+        <w:tc>
+          <w:tcPr>
+            <w:tcW w:type="dxa" w:w="3389"/>
+            <w:vAlign w:val="center"/>
+            <w:shd w:fill="7D1238"/>
+          </w:tcPr>
+          <w:p>
+            <w:r>
+              <w:t>Difficulty</w:t>
+            </w:r>
+          </w:p>
+        </w:tc>
+        <w:trPr>
+          <w:tblHeader/>
+        </w:trPr>
+      </w:tr>
+      <w:tr>
+        <w:tc>
+          <w:tcPr>
+            <w:tcW w:type="dxa" w:w="3389"/>
+            <w:vAlign w:val="center"/>
+          </w:tcPr>
+          <w:p>
+            <w:r>
+              <w:t>45-60 min</w:t>
+            </w:r>
+          </w:p>
+        </w:tc>
+        <w:tc>
+          <w:tcPr>
+            <w:tcW w:type="dxa" w:w="3389"/>
+            <w:vAlign w:val="center"/>
+          </w:tcPr>
+          <w:p>
+            <w:r>
+              <w:t>Pairs</w:t>
+            </w:r>
+          </w:p>
+        </w:tc>
+        <w:tc>
+          <w:tcPr>
+            <w:tcW w:type="dxa" w:w="3389"/>
+            <w:vAlign w:val="center"/>
+          </w:tcPr>
+          <w:p>
+            <w:r>
+              <w:t>Intermediate</w:t>
+            </w:r>
+          </w:p>
+        </w:tc>
+      </w:tr>
+    </w:tbl>
+    <w:p>
+      <w:pPr>
+        <w:pStyle w:val="Heading2"/>
+      </w:pPr>
+      <w:r>
+        <w:t>Learning objectives</w:t>
+      </w:r>
+    </w:p>
+    <w:p>
+      <w:pPr>
+        <w:pStyle w:val="ListBullet"/>
+      </w:pPr>
+      <w:r>
+        <w:t>Relate fuel-supported steam capacity to feedwater flow and drum inventory.</w:t>
+      </w:r>
+    </w:p>
+    <w:p>
+      <w:pPr>
+        <w:pStyle w:val="ListBullet"/>
+      </w:pPr>
+      <w:r>
+        <w:t>Recognize the delayed low-fuel-for-feedwater warning before a large level excursion develops.</w:t>
+      </w:r>
+    </w:p>
+    <w:p>
+      <w:pPr>
+        <w:pStyle w:val="ListBullet"/>
+      </w:pPr>
+      <w:r>
+        <w:t>Separate transient shrink/swell indication from sustained inventory accumulation.</w:t>
+      </w:r>
+    </w:p>
+    <w:p>
+      <w:pPr>
+        <w:pStyle w:val="Heading2"/>
+      </w:pPr>
+      <w:r>
+        <w:t>Initial setup</w:t>
+      </w:r>
+    </w:p>
+    <w:p>
+      <w:pPr>
+        <w:pStyle w:val="ListBullet"/>
+      </w:pPr>
+      <w:r>
+        <w:t>Reset, stabilize and keep three-element or Auto-select level control enabled.</w:t>
+      </w:r>
+    </w:p>
+    <w:p>
+      <w:pPr>
+        <w:pStyle w:val="ListBullet"/>
+      </w:pPr>
+      <w:r>
+        <w:t>Display Trends, Diagnostics and Alarms together where practical.</w:t>
+      </w:r>
+    </w:p>
+    <w:p>
+      <w:pPr>
+        <w:pStyle w:val="ListBullet"/>
+      </w:pPr>
+      <w:r>
+        <w:t>Record the configured fuel/feedwater warning margin and delay.</w:t>
+      </w:r>
+    </w:p>
+    <w:p>
+      <w:pPr>
+        <w:pStyle w:val="Heading2"/>
+      </w:pPr>
+      <w:r>
+        <w:t>Procedure</w:t>
+      </w:r>
+    </w:p>
+    <w:p>
+      <w:pPr>
+        <w:pStyle w:val="ListNumber"/>
+      </w:pPr>
+      <w:r>
+        <w:t>Record the baseline fuel-supported steam capacity, steam flow, feedwater flow, drum inventory/level and adequacy.</w:t>
+      </w:r>
+    </w:p>
+    <w:p>
+      <w:pPr>
+        <w:pStyle w:val="ListNumber"/>
+      </w:pPr>
+      <w:r>
+        <w:t>Apply Fuel quality -5% repeatedly or inject a low-fuel condition while holding steam demand and feedwater conditions initially unchanged.</w:t>
+      </w:r>
+    </w:p>
+    <w:p>
+      <w:pPr>
+        <w:pStyle w:val="ListNumber"/>
+      </w:pPr>
+      <w:r>
+        <w:t>Observe the warning timer, fuel/feedwater adequacy and the longer-term drum-level direction.</w:t>
+      </w:r>
+    </w:p>
+    <w:p>
+      <w:pPr>
+        <w:pStyle w:val="ListNumber"/>
+      </w:pPr>
+      <w:r>
+        <w:t>Compare the short shrink/swell response with the sustained inventory trend.</w:t>
+      </w:r>
+    </w:p>
+    <w:p>
+      <w:pPr>
+        <w:pStyle w:val="ListNumber"/>
+      </w:pPr>
+      <w:r>
+        <w:t>Recover by restoring fuel quality or matching feedwater and firing, then document the response sequence.</w:t>
+      </w:r>
+    </w:p>
+    <w:p>
+      <w:pPr>
+        <w:pStyle w:val="Heading2"/>
+      </w:pPr>
+      <w:r>
+        <w:t>Data to record</w:t>
+      </w:r>
+    </w:p>
+    <w:tbl>
+      <w:tblPr>
+        <w:tblStyle w:val="TableGrid"/>
+        <w:tblW w:type="auto" w:w="0"/>
+        <w:jc w:val="center"/>
+        <w:tblLook w:firstColumn="1" w:firstRow="1" w:lastColumn="0" w:lastRow="0" w:noHBand="0" w:noVBand="1" w:val="04A0"/>
+      </w:tblPr>
+      <w:tblGrid>
+        <w:gridCol w:w="5083"/>
+        <w:gridCol w:w="5083"/>
+      </w:tblGrid>
+      <w:tr>
+        <w:tc>
+          <w:tcPr>
+            <w:tcW w:type="dxa" w:w="5083"/>
+            <w:vAlign w:val="center"/>
+            <w:shd w:fill="333333"/>
+          </w:tcPr>
+          <w:p>
+            <w:r>
+              <w:t>Variable / observation</w:t>
+            </w:r>
+          </w:p>
+        </w:tc>
+        <w:tc>
+          <w:tcPr>
+            <w:tcW w:type="dxa" w:w="5083"/>
+            <w:vAlign w:val="center"/>
+            <w:shd w:fill="333333"/>
+          </w:tcPr>
+          <w:p>
+            <w:r>
+              <w:t>Recorded value / notes</w:t>
+            </w:r>
+          </w:p>
+        </w:tc>
+        <w:trPr>
+          <w:tblHeader/>
+        </w:trPr>
+      </w:tr>
+      <w:tr>
+        <w:tc>
+          <w:tcPr>
+            <w:tcW w:type="dxa" w:w="5083"/>
+            <w:vAlign w:val="center"/>
+          </w:tcPr>
+          <w:p>
+            <w:r>
+              <w:t>Fuel-supported steam capacity (kg/s)</w:t>
+            </w:r>
+          </w:p>
+        </w:tc>
+        <w:tc>
+          <w:tcPr>
+            <w:tcW w:type="dxa" w:w="5083"/>
+            <w:vAlign w:val="center"/>
+          </w:tcPr>
+          <w:p>
+            <w:r/>
+          </w:p>
+        </w:tc>
+      </w:tr>
+      <w:tr>
+        <w:tc>
+          <w:tcPr>
+            <w:tcW w:type="dxa" w:w="5083"/>
+            <w:vAlign w:val="center"/>
+          </w:tcPr>
+          <w:p>
+            <w:r>
+              <w:t>Actual steam flow (kg/s)</w:t>
+            </w:r>
+          </w:p>
+        </w:tc>
+        <w:tc>
+          <w:tcPr>
+            <w:tcW w:type="dxa" w:w="5083"/>
+            <w:vAlign w:val="center"/>
+          </w:tcPr>
+          <w:p>
+            <w:r/>
+          </w:p>
+        </w:tc>
+      </w:tr>
+      <w:tr>
+        <w:tc>
+          <w:tcPr>
+            <w:tcW w:type="dxa" w:w="5083"/>
+            <w:vAlign w:val="center"/>
+          </w:tcPr>
+          <w:p>
+            <w:r>
+              <w:t>Feedwater flow (kg/s)</w:t>
+            </w:r>
+          </w:p>
+        </w:tc>
+        <w:tc>
+          <w:tcPr>
+            <w:tcW w:type="dxa" w:w="5083"/>
+            <w:vAlign w:val="center"/>
+          </w:tcPr>
+          <w:p>
+            <w:r/>
+          </w:p>
+        </w:tc>
+      </w:tr>
+      <w:tr>
+        <w:tc>
+          <w:tcPr>
+            <w:tcW w:type="dxa" w:w="5083"/>
+            <w:vAlign w:val="center"/>
+          </w:tcPr>
+          <w:p>
+            <w:r>
+              <w:t>Fuel/feedwater adequacy (%)</w:t>
+            </w:r>
+          </w:p>
+        </w:tc>
+        <w:tc>
+          <w:tcPr>
+            <w:tcW w:type="dxa" w:w="5083"/>
+            <w:vAlign w:val="center"/>
+          </w:tcPr>
+          <w:p>
+            <w:r/>
+          </w:p>
+        </w:tc>
+      </w:tr>
+      <w:tr>
+        <w:tc>
+          <w:tcPr>
+            <w:tcW w:type="dxa" w:w="5083"/>
+            <w:vAlign w:val="center"/>
+          </w:tcPr>
+          <w:p>
+            <w:r>
+              <w:t>Warning timer/status</w:t>
+            </w:r>
+          </w:p>
+        </w:tc>
+        <w:tc>
+          <w:tcPr>
+            <w:tcW w:type="dxa" w:w="5083"/>
+            <w:vAlign w:val="center"/>
+          </w:tcPr>
+          <w:p>
+            <w:r/>
+          </w:p>
+        </w:tc>
+      </w:tr>
+      <w:tr>
+        <w:tc>
+          <w:tcPr>
+            <w:tcW w:type="dxa" w:w="5083"/>
+            <w:vAlign w:val="center"/>
+          </w:tcPr>
+          <w:p>
+            <w:r>
+              <w:t>Drum inventory/level (%)</w:t>
+            </w:r>
+          </w:p>
+        </w:tc>
+        <w:tc>
+          <w:tcPr>
+            <w:tcW w:type="dxa" w:w="5083"/>
+            <w:vAlign w:val="center"/>
+          </w:tcPr>
+          <w:p>
+            <w:r/>
+          </w:p>
+        </w:tc>
+      </w:tr>
+      <w:tr>
+        <w:tc>
+          <w:tcPr>
+            <w:tcW w:type="dxa" w:w="5083"/>
+            <w:vAlign w:val="center"/>
+          </w:tcPr>
+          <w:p>
+            <w:r>
+              <w:t>Shrink/swell contribution</w:t>
+            </w:r>
+          </w:p>
+        </w:tc>
+        <w:tc>
+          <w:tcPr>
+            <w:tcW w:type="dxa" w:w="5083"/>
+            <w:vAlign w:val="center"/>
+          </w:tcPr>
+          <w:p>
+            <w:r/>
+          </w:p>
+        </w:tc>
+      </w:tr>
+      <w:tr>
+        <w:tc>
+          <w:tcPr>
+            <w:tcW w:type="dxa" w:w="5083"/>
+            <w:vAlign w:val="center"/>
+          </w:tcPr>
+          <w:p>
+            <w:r>
+              <w:t>Recovery action</w:t>
+            </w:r>
+          </w:p>
+        </w:tc>
+        <w:tc>
+          <w:tcPr>
+            <w:tcW w:type="dxa" w:w="5083"/>
+            <w:vAlign w:val="center"/>
+          </w:tcPr>
+          <w:p>
+            <w:r/>
+          </w:p>
+        </w:tc>
+      </w:tr>
+      <w:tr>
+        <w:tc>
+          <w:tcPr>
+            <w:tcW w:type="dxa" w:w="5083"/>
+            <w:vAlign w:val="center"/>
+          </w:tcPr>
+          <w:p>
+            <w:r>
+              <w:t>Recovery time (s)</w:t>
+            </w:r>
+          </w:p>
+        </w:tc>
+        <w:tc>
+          <w:tcPr>
+            <w:tcW w:type="dxa" w:w="5083"/>
+            <w:vAlign w:val="center"/>
+          </w:tcPr>
+          <w:p>
+            <w:r/>
+          </w:p>
+        </w:tc>
+      </w:tr>
+    </w:tbl>
+    <w:p>
+      <w:pPr>
+        <w:pStyle w:val="Heading2"/>
+      </w:pPr>
+      <w:r>
+        <w:t>Analysis and discussion questions</w:t>
+      </w:r>
+    </w:p>
+    <w:p>
+      <w:pPr>
+        <w:pStyle w:val="ListNumber"/>
+      </w:pPr>
+      <w:r>
+        <w:t>Why can drum inventory rise when insufficient fuel is available?</w:t>
+      </w:r>
+    </w:p>
+    <w:p>
+      <w:pPr>
+        <w:pStyle w:val="ListNumber"/>
+      </w:pPr>
+      <w:r>
+        <w:t>Why is the warning delayed rather than activated by one noisy sample?</w:t>
+      </w:r>
+    </w:p>
+    <w:p>
+      <w:pPr>
+        <w:pStyle w:val="ListNumber"/>
+      </w:pPr>
+      <w:r>
+        <w:t>Which measurements distinguish a temporary swell from genuine mass accumulation?</w:t>
+      </w:r>
+    </w:p>
+    <w:p>
+      <w:pPr>
+        <w:pStyle w:val="ListNumber"/>
+      </w:pPr>
+      <w:r>
+        <w:t>What operator action is educationally appropriate, and what real-plant safeguards are outside this simulator?</w:t>
+      </w:r>
+    </w:p>
+    <w:p>
+      <w:pPr>
+        <w:pStyle w:val="Heading2"/>
+      </w:pPr>
+      <w:r>
+        <w:t>Expected qualitative behaviour</w:t>
+      </w:r>
+    </w:p>
+    <w:p>
+      <w:pPr>
+        <w:pStyle w:val="ListBullet"/>
+      </w:pPr>
+      <w:r>
+        <w:t>Reduced fuel energy lowers evaporation capability before drum level changes dramatically.</w:t>
+      </w:r>
+    </w:p>
+    <w:p>
+      <w:pPr>
+        <w:pStyle w:val="ListBullet"/>
+      </w:pPr>
+      <w:r>
+        <w:t>If feedwater exceeds energy-supported steam generation, inventory trends upward and the warning eventually activates.</w:t>
+      </w:r>
+    </w:p>
+    <w:p>
+      <w:pPr>
+        <w:pStyle w:val="ListBullet"/>
+      </w:pPr>
+      <w:r>
+        <w:t>Shrink/swell decays as a transient indication, while a true mass imbalance persists.</w:t>
+      </w:r>
+    </w:p>
+    <w:p>
+      <w:pPr>
+        <w:pStyle w:val="ListBullet"/>
+      </w:pPr>
+      <w:r>
+        <w:t>Restoring the energy/flow balance arrests the inventory drift; controller action cannot manufacture missing heat.</w:t>
+      </w:r>
+    </w:p>
+    <w:p>
+      <w:pPr>
+        <w:pStyle w:val="TeachingNote"/>
+      </w:pPr>
+      <w:r>
+        <w:t>Teaching note: This is an inventory-control exercise. It does not model every real drum-boiler protection, trip or startup permissive.</w:t>
+      </w:r>
+    </w:p>
+    <w:p>
+      <w:pPr>
+        <w:pStyle w:val="ExerciseTitle"/>
+      </w:pPr>
+      <w:r>
+        <w:t>Exercise 13: Alarm Chronology, Trend Timebase and Analyzer Lag</w:t>
+      </w:r>
+    </w:p>
+    <w:tbl>
+      <w:tblPr>
+        <w:tblStyle w:val="TableGrid"/>
+        <w:tblW w:type="auto" w:w="0"/>
+        <w:jc w:val="center"/>
+        <w:tblLook w:firstColumn="1" w:firstRow="1" w:lastColumn="0" w:lastRow="0" w:noHBand="0" w:noVBand="1" w:val="04A0"/>
+      </w:tblPr>
+      <w:tblGrid>
+        <w:gridCol w:w="3389"/>
+        <w:gridCol w:w="3389"/>
+        <w:gridCol w:w="3389"/>
+      </w:tblGrid>
+      <w:tr>
+        <w:tc>
+          <w:tcPr>
+            <w:tcW w:type="dxa" w:w="3389"/>
+            <w:vAlign w:val="center"/>
+            <w:shd w:fill="7D1238"/>
+          </w:tcPr>
+          <w:p>
+            <w:r>
+              <w:t>Suggested duration</w:t>
+            </w:r>
+          </w:p>
+        </w:tc>
+        <w:tc>
+          <w:tcPr>
+            <w:tcW w:type="dxa" w:w="3389"/>
+            <w:vAlign w:val="center"/>
+            <w:shd w:fill="7D1238"/>
+          </w:tcPr>
+          <w:p>
+            <w:r>
+              <w:t>Format</w:t>
+            </w:r>
+          </w:p>
+        </w:tc>
+        <w:tc>
+          <w:tcPr>
+            <w:tcW w:type="dxa" w:w="3389"/>
+            <w:vAlign w:val="center"/>
+            <w:shd w:fill="7D1238"/>
+          </w:tcPr>
+          <w:p>
+            <w:r>
+              <w:t>Difficulty</w:t>
+            </w:r>
+          </w:p>
+        </w:tc>
+        <w:trPr>
+          <w:tblHeader/>
+        </w:trPr>
+      </w:tr>
+      <w:tr>
+        <w:tc>
+          <w:tcPr>
+            <w:tcW w:type="dxa" w:w="3389"/>
+            <w:vAlign w:val="center"/>
+          </w:tcPr>
+          <w:p>
+            <w:r>
+              <w:t>60 min</w:t>
+            </w:r>
+          </w:p>
+        </w:tc>
+        <w:tc>
+          <w:tcPr>
+            <w:tcW w:type="dxa" w:w="3389"/>
+            <w:vAlign w:val="center"/>
+          </w:tcPr>
+          <w:p>
+            <w:r>
+              <w:t>Teams of 3</w:t>
+            </w:r>
+          </w:p>
+        </w:tc>
+        <w:tc>
+          <w:tcPr>
+            <w:tcW w:type="dxa" w:w="3389"/>
+            <w:vAlign w:val="center"/>
+          </w:tcPr>
+          <w:p>
+            <w:r>
+              <w:t>Advanced</w:t>
+            </w:r>
+          </w:p>
+        </w:tc>
+      </w:tr>
+    </w:tbl>
+    <w:p>
+      <w:pPr>
+        <w:pStyle w:val="Heading2"/>
+      </w:pPr>
+      <w:r>
+        <w:t>Learning objectives</w:t>
+      </w:r>
+    </w:p>
+    <w:p>
+      <w:pPr>
+        <w:pStyle w:val="ListBullet"/>
+      </w:pPr>
+      <w:r>
+        <w:t>Read rolling trend x-axes correctly as simulated seconds before present.</w:t>
+      </w:r>
+    </w:p>
+    <w:p>
+      <w:pPr>
+        <w:pStyle w:val="ListBullet"/>
+      </w:pPr>
+      <w:r>
+        <w:t>Build a cause-and-effect chronology from process variables, analyzer outputs, alarms and controller responses.</w:t>
+      </w:r>
+    </w:p>
+    <w:p>
+      <w:pPr>
+        <w:pStyle w:val="ListBullet"/>
+      </w:pPr>
+      <w:r>
+        <w:t>Explain why analyzer lag can delay or distort fault diagnosis.</w:t>
+      </w:r>
+    </w:p>
+    <w:p>
+      <w:pPr>
+        <w:pStyle w:val="Heading2"/>
+      </w:pPr>
+      <w:r>
+        <w:t>Initial setup</w:t>
+      </w:r>
+    </w:p>
+    <w:p>
+      <w:pPr>
+        <w:pStyle w:val="ListBullet"/>
+      </w:pPr>
+      <w:r>
+        <w:t>Reset, clear trends and select 1x speed.</w:t>
+      </w:r>
+    </w:p>
+    <w:p>
+      <w:pPr>
+        <w:pStyle w:val="ListBullet"/>
+      </w:pPr>
+      <w:r>
+        <w:t>Set analyzer lag to 8 s for the first run and note the configured alarm thresholds.</w:t>
+      </w:r>
+    </w:p>
+    <w:p>
+      <w:pPr>
+        <w:pStyle w:val="ListBullet"/>
+      </w:pPr>
+      <w:r>
+        <w:t>Assign operator, recorder and diagnostician roles.</w:t>
+      </w:r>
+    </w:p>
+    <w:p>
+      <w:pPr>
+        <w:pStyle w:val="Heading2"/>
+      </w:pPr>
+      <w:r>
+        <w:t>Procedure</w:t>
+      </w:r>
+    </w:p>
+    <w:p>
+      <w:pPr>
+        <w:pStyle w:val="ListNumber"/>
+      </w:pPr>
+      <w:r>
+        <w:t>Inject Air-starved firing and record the simulated time at which O2, CO and the alarm first show a clear response.</w:t>
+      </w:r>
+    </w:p>
+    <w:p>
+      <w:pPr>
+        <w:pStyle w:val="ListNumber"/>
+      </w:pPr>
+      <w:r>
+        <w:t>Clear the fault, repeat with analyzer lag near its minimum and compare detection order and delay.</w:t>
+      </w:r>
+    </w:p>
+    <w:p>
+      <w:pPr>
+        <w:pStyle w:val="ListNumber"/>
+      </w:pPr>
+      <w:r>
+        <w:t>Repeat using Wet fuel or High fuel-nitrogen/NOx excursion and track dew-point or NOx alarm chronology.</w:t>
+      </w:r>
+    </w:p>
+    <w:p>
+      <w:pPr>
+        <w:pStyle w:val="ListNumber"/>
+      </w:pPr>
+      <w:r>
+        <w:t>Explain why the newest sample is at zero seconds before present and older samples appear toward the negative/earlier side of the rolling window.</w:t>
+      </w:r>
+    </w:p>
+    <w:p>
+      <w:pPr>
+        <w:pStyle w:val="ListNumber"/>
+      </w:pPr>
+      <w:r>
+        <w:t>Prepare a one-minute incident briefing stating initiating event, first reliable symptom, controller response, alarm and recommended action.</w:t>
+      </w:r>
+    </w:p>
+    <w:p>
+      <w:pPr>
+        <w:pStyle w:val="Heading2"/>
+      </w:pPr>
+      <w:r>
+        <w:t>Data to record</w:t>
+      </w:r>
+    </w:p>
+    <w:tbl>
+      <w:tblPr>
+        <w:tblStyle w:val="TableGrid"/>
+        <w:tblW w:type="auto" w:w="0"/>
+        <w:jc w:val="center"/>
+        <w:tblLook w:firstColumn="1" w:firstRow="1" w:lastColumn="0" w:lastRow="0" w:noHBand="0" w:noVBand="1" w:val="04A0"/>
+      </w:tblPr>
+      <w:tblGrid>
+        <w:gridCol w:w="5083"/>
+        <w:gridCol w:w="5083"/>
+      </w:tblGrid>
+      <w:tr>
+        <w:tc>
+          <w:tcPr>
+            <w:tcW w:type="dxa" w:w="5083"/>
+            <w:vAlign w:val="center"/>
+            <w:shd w:fill="333333"/>
+          </w:tcPr>
+          <w:p>
+            <w:r>
+              <w:t>Variable / observation</w:t>
+            </w:r>
+          </w:p>
+        </w:tc>
+        <w:tc>
+          <w:tcPr>
+            <w:tcW w:type="dxa" w:w="5083"/>
+            <w:vAlign w:val="center"/>
+            <w:shd w:fill="333333"/>
+          </w:tcPr>
+          <w:p>
+            <w:r>
+              <w:t>Recorded value / notes</w:t>
+            </w:r>
+          </w:p>
+        </w:tc>
+        <w:trPr>
+          <w:tblHeader/>
+        </w:trPr>
+      </w:tr>
+      <w:tr>
+        <w:tc>
+          <w:tcPr>
+            <w:tcW w:type="dxa" w:w="5083"/>
+            <w:vAlign w:val="center"/>
+          </w:tcPr>
+          <w:p>
+            <w:r>
+              <w:t>Fault and injection time (sim s)</w:t>
+            </w:r>
+          </w:p>
+        </w:tc>
+        <w:tc>
+          <w:tcPr>
+            <w:tcW w:type="dxa" w:w="5083"/>
+            <w:vAlign w:val="center"/>
+          </w:tcPr>
+          <w:p>
+            <w:r/>
+          </w:p>
+        </w:tc>
+      </w:tr>
+      <w:tr>
+        <w:tc>
+          <w:tcPr>
+            <w:tcW w:type="dxa" w:w="5083"/>
+            <w:vAlign w:val="center"/>
+          </w:tcPr>
+          <w:p>
+            <w:r>
+              <w:t>First process response</w:t>
+            </w:r>
+          </w:p>
+        </w:tc>
+        <w:tc>
+          <w:tcPr>
+            <w:tcW w:type="dxa" w:w="5083"/>
+            <w:vAlign w:val="center"/>
+          </w:tcPr>
+          <w:p>
+            <w:r/>
+          </w:p>
+        </w:tc>
+      </w:tr>
+      <w:tr>
+        <w:tc>
+          <w:tcPr>
+            <w:tcW w:type="dxa" w:w="5083"/>
+            <w:vAlign w:val="center"/>
+          </w:tcPr>
+          <w:p>
+            <w:r>
+              <w:t>First analyzer response</w:t>
+            </w:r>
+          </w:p>
+        </w:tc>
+        <w:tc>
+          <w:tcPr>
+            <w:tcW w:type="dxa" w:w="5083"/>
+            <w:vAlign w:val="center"/>
+          </w:tcPr>
+          <w:p>
+            <w:r/>
+          </w:p>
+        </w:tc>
+      </w:tr>
+      <w:tr>
+        <w:tc>
+          <w:tcPr>
+            <w:tcW w:type="dxa" w:w="5083"/>
+            <w:vAlign w:val="center"/>
+          </w:tcPr>
+          <w:p>
+            <w:r>
+              <w:t>Alarm annunciation time</w:t>
+            </w:r>
+          </w:p>
+        </w:tc>
+        <w:tc>
+          <w:tcPr>
+            <w:tcW w:type="dxa" w:w="5083"/>
+            <w:vAlign w:val="center"/>
+          </w:tcPr>
+          <w:p>
+            <w:r/>
+          </w:p>
+        </w:tc>
+      </w:tr>
+      <w:tr>
+        <w:tc>
+          <w:tcPr>
+            <w:tcW w:type="dxa" w:w="5083"/>
+            <w:vAlign w:val="center"/>
+          </w:tcPr>
+          <w:p>
+            <w:r>
+              <w:t>O2/CO/NOx/UHC response</w:t>
+            </w:r>
+          </w:p>
+        </w:tc>
+        <w:tc>
+          <w:tcPr>
+            <w:tcW w:type="dxa" w:w="5083"/>
+            <w:vAlign w:val="center"/>
+          </w:tcPr>
+          <w:p>
+            <w:r/>
+          </w:p>
+        </w:tc>
+      </w:tr>
+      <w:tr>
+        <w:tc>
+          <w:tcPr>
+            <w:tcW w:type="dxa" w:w="5083"/>
+            <w:vAlign w:val="center"/>
+          </w:tcPr>
+          <w:p>
+            <w:r>
+              <w:t>Dew-point margin</w:t>
+            </w:r>
+          </w:p>
+        </w:tc>
+        <w:tc>
+          <w:tcPr>
+            <w:tcW w:type="dxa" w:w="5083"/>
+            <w:vAlign w:val="center"/>
+          </w:tcPr>
+          <w:p>
+            <w:r/>
+          </w:p>
+        </w:tc>
+      </w:tr>
+      <w:tr>
+        <w:tc>
+          <w:tcPr>
+            <w:tcW w:type="dxa" w:w="5083"/>
+            <w:vAlign w:val="center"/>
+          </w:tcPr>
+          <w:p>
+            <w:r>
+              <w:t>Controller/mode response</w:t>
+            </w:r>
+          </w:p>
+        </w:tc>
+        <w:tc>
+          <w:tcPr>
+            <w:tcW w:type="dxa" w:w="5083"/>
+            <w:vAlign w:val="center"/>
+          </w:tcPr>
+          <w:p>
+            <w:r/>
+          </w:p>
+        </w:tc>
+      </w:tr>
+      <w:tr>
+        <w:tc>
+          <w:tcPr>
+            <w:tcW w:type="dxa" w:w="5083"/>
+            <w:vAlign w:val="center"/>
+          </w:tcPr>
+          <w:p>
+            <w:r>
+              <w:t>Diagnosis and confidence</w:t>
+            </w:r>
+          </w:p>
+        </w:tc>
+        <w:tc>
+          <w:tcPr>
+            <w:tcW w:type="dxa" w:w="5083"/>
+            <w:vAlign w:val="center"/>
+          </w:tcPr>
+          <w:p>
+            <w:r/>
+          </w:p>
+        </w:tc>
+      </w:tr>
+      <w:tr>
+        <w:tc>
+          <w:tcPr>
+            <w:tcW w:type="dxa" w:w="5083"/>
+            <w:vAlign w:val="center"/>
+          </w:tcPr>
+          <w:p>
+            <w:r>
+              <w:t>Recommended action</w:t>
+            </w:r>
+          </w:p>
+        </w:tc>
+        <w:tc>
+          <w:tcPr>
+            <w:tcW w:type="dxa" w:w="5083"/>
+            <w:vAlign w:val="center"/>
+          </w:tcPr>
+          <w:p>
+            <w:r/>
+          </w:p>
+        </w:tc>
+      </w:tr>
+    </w:tbl>
+    <w:p>
+      <w:pPr>
+        <w:pStyle w:val="Heading2"/>
+      </w:pPr>
+      <w:r>
+        <w:t>Analysis and discussion questions</w:t>
+      </w:r>
+    </w:p>
+    <w:p>
+      <w:pPr>
+        <w:pStyle w:val="ListNumber"/>
+      </w:pPr>
+      <w:r>
+        <w:t>Which variables respond as process states and which are delayed analyzer indications?</w:t>
+      </w:r>
+    </w:p>
+    <w:p>
+      <w:pPr>
+        <w:pStyle w:val="ListNumber"/>
+      </w:pPr>
+      <w:r>
+        <w:t>How does analyzer lag change diagnosis without changing the underlying combustion state?</w:t>
+      </w:r>
+    </w:p>
+    <w:p>
+      <w:pPr>
+        <w:pStyle w:val="ListNumber"/>
+      </w:pPr>
+      <w:r>
+        <w:t>Why should alarm order not automatically be interpreted as causal order?</w:t>
+      </w:r>
+    </w:p>
+    <w:p>
+      <w:pPr>
+        <w:pStyle w:val="ListNumber"/>
+      </w:pPr>
+      <w:r>
+        <w:t>Which paired indications provide the strongest evidence for each injected fault?</w:t>
+      </w:r>
+    </w:p>
+    <w:p>
+      <w:pPr>
+        <w:pStyle w:val="ListNumber"/>
+      </w:pPr>
+      <w:r>
+        <w:t>How would a different simulation-speed setting affect wall-clock observation but not simulated-time chronology?</w:t>
+      </w:r>
+    </w:p>
+    <w:p>
+      <w:pPr>
+        <w:pStyle w:val="Heading2"/>
+      </w:pPr>
+      <w:r>
+        <w:t>Expected qualitative behaviour</w:t>
+      </w:r>
+    </w:p>
+    <w:p>
+      <w:pPr>
+        <w:pStyle w:val="ListBullet"/>
+      </w:pPr>
+      <w:r>
+        <w:t>Process and controller variables can move before lagged flue-gas analyzer values.</w:t>
+      </w:r>
+    </w:p>
+    <w:p>
+      <w:pPr>
+        <w:pStyle w:val="ListBullet"/>
+      </w:pPr>
+      <w:r>
+        <w:t>Lower analyzer lag shortens indicated detection time but does not alter the modeled fault itself.</w:t>
+      </w:r>
+    </w:p>
+    <w:p>
+      <w:pPr>
+        <w:pStyle w:val="ListBullet"/>
+      </w:pPr>
+      <w:r>
+        <w:t>The rolling x-axis represents simulated time relative to the present, not sample number.</w:t>
+      </w:r>
+    </w:p>
+    <w:p>
+      <w:pPr>
+        <w:pStyle w:val="ListBullet"/>
+      </w:pPr>
+      <w:r>
+        <w:t>A defensible diagnosis combines chronology with multiple physically related indications.</w:t>
+      </w:r>
+    </w:p>
+    <w:p>
+      <w:pPr>
+        <w:pStyle w:val="TeachingNote"/>
+      </w:pPr>
+      <w:r>
+        <w:t>Teaching note: Use one principal fault at a time for assessment. Combined faults may be used only after students establish the individual signatures.</w:t>
       </w:r>
     </w:p>
     <w:p>
@@ -7109,6 +8815,9 @@
             </w:r>
           </w:p>
         </w:tc>
+        <w:trPr>
+          <w:tblHeader/>
+        </w:trPr>
       </w:tr>
       <w:tr>
         <w:tc>
@@ -7133,13 +8842,8 @@
             <w:vAlign w:val="center"/>
           </w:tcPr>
           <w:p>
-            <w:r/>
             <w:r>
-              <w:rPr>
-                <w:b w:val="0"/>
-                <w:sz w:val="18"/>
-              </w:rPr>
-              <w:t>Exercises 1 and 2, followed by selected fault demonstrations from Exercise 8.</w:t>
+              <w:t>Exercises 1 and 2, followed by selected fault demonstrations from Exercise 8 or the chronology activity in Exercise 13.</w:t>
             </w:r>
           </w:p>
         </w:tc>
@@ -7167,13 +8871,8 @@
             <w:vAlign w:val="center"/>
           </w:tcPr>
           <w:p>
-            <w:r/>
             <w:r>
-              <w:rPr>
-                <w:b w:val="0"/>
-                <w:sz w:val="18"/>
-              </w:rPr>
-              <w:t>Exercises 1, 4 and 6, with a short report.</w:t>
+              <w:t>Exercises 1, 4 and 6, with Exercise 12 as an inventory-control extension.</w:t>
             </w:r>
           </w:p>
         </w:tc>
@@ -7201,13 +8900,8 @@
             <w:vAlign w:val="center"/>
           </w:tcPr>
           <w:p>
-            <w:r/>
             <w:r>
-              <w:rPr>
-                <w:b w:val="0"/>
-                <w:sz w:val="18"/>
-              </w:rPr>
-              <w:t>Exercises 2, 3, 7 and 9.</w:t>
+              <w:t>Exercises 2, 3, 7, 9 and selected Sankey comparisons from Exercise 11.</w:t>
             </w:r>
           </w:p>
         </w:tc>
@@ -7235,13 +8929,8 @@
             <w:vAlign w:val="center"/>
           </w:tcPr>
           <w:p>
-            <w:r/>
             <w:r>
-              <w:rPr>
-                <w:b w:val="0"/>
-                <w:sz w:val="18"/>
-              </w:rPr>
-              <w:t>Exercises 4, 5 and 6.</w:t>
+              <w:t>Exercises 4, 5, 6, 12 and 13.</w:t>
             </w:r>
           </w:p>
         </w:tc>
@@ -7269,13 +8958,8 @@
             <w:vAlign w:val="center"/>
           </w:tcPr>
           <w:p>
-            <w:r/>
             <w:r>
-              <w:rPr>
-                <w:b w:val="0"/>
-                <w:sz w:val="18"/>
-              </w:rPr>
-              <w:t>Exercise 10 with CSV analysis and a group presentation.</w:t>
+              <w:t>Exercise 10 supported by Exercises 11-13 and CSV analysis, followed by a group presentation.</w:t>
             </w:r>
           </w:p>
         </w:tc>
@@ -7339,7 +9023,7 @@
     </w:p>
     <w:p>
       <w:r>
-        <w:t>These exercises were derived from the controls, calculations, fault cases, displays and logging functions implemented in the supplied Live Boiler/Furnace Transient Simulator Python code. The simulator itself states that its water/steam property helpers are simplified approximations informed by IAPWS-IF97, and that its NOx and UHC calculations are teaching-level trend models rather than regulatory predictions.</w:t>
+        <w:t>These exercises were derived from the controls, calculations, fault cases, alarm logic, time-based trends, live Energy Sankey and logging functions implemented in Live Boiler/Furnace Transient Simulator v1.2.0. The simulator states that its water/steam property helpers are simplified approximations informed by IAPWS-IF97, and that its NOx and UHC calculations are teaching-level trend models rather than regulatory predictions.</w:t>
       </w:r>
     </w:p>
     <w:sectPr>

</xml_diff>